<commit_message>
List 5-star dossiers in their own section of the decision draft (#79 review S3)
The draft no longer counts or lists 5-star dossiers among the recognized
products: the template loops over sections (3 sao, 4 sao, and the section
'đạt điểm đề nghị Trung ương đánh giá, phân hạng 5 sao').

Co-Authored-By: Claude Opus 5.5 <noreply@anthropic.com>
</commit_message>
<xml_diff>
--- a/packages/infra/templates/du-thao-quyet-dinh-cong-nhan.docx
+++ b/packages/infra/templates/du-thao-quyet-dinh-cong-nhan.docx
@@ -152,7 +152,25 @@
           <w:b w:val="0"/>
           <w:i w:val="0"/>
         </w:rPr>
-        <w:t>Điều 1. Công nhận {count} sản phẩm đạt chuẩn OCOP có tên sau:</w:t>
+        <w:t xml:space="preserve">Điều 1. Công nhận {count} sản phẩm đạt chuẩn OCOP{^supplementary} và phê duyệt kết quả đánh giá, phân hạng sản phẩm{/supplementary}, theo các mục sau:</w:t>
+      </w:r>
+    </w:p>
+    <w:p>
+      <w:r>
+        <w:rPr>
+          <w:b w:val="0"/>
+          <w:i w:val="0"/>
+        </w:rPr>
+        <w:t xml:space="preserve">{#sections}</w:t>
+      </w:r>
+    </w:p>
+    <w:p>
+      <w:r>
+        <w:rPr>
+          <w:b/>
+          <w:i w:val="0"/>
+        </w:rPr>
+        <w:t xml:space="preserve">{index}. {heading} ({count} sản phẩm):</w:t>
       </w:r>
     </w:p>
     <w:tbl>
@@ -364,6 +382,15 @@
         </w:tc>
       </w:tr>
     </w:tbl>
+    <w:p>
+      <w:r>
+        <w:rPr>
+          <w:b w:val="0"/>
+          <w:i w:val="0"/>
+        </w:rPr>
+        <w:t xml:space="preserve">{/sections}</w:t>
+      </w:r>
+    </w:p>
     <w:p>
       <w:r>
         <w:rPr>

</xml_diff>